<commit_message>
Fill in reflection, declaration and references in final documentation
</commit_message>
<xml_diff>
--- a/docs/final-documentation.docx
+++ b/docs/final-documentation.docx
@@ -98,7 +98,7 @@
         </w:rPr>
         <w:t xml:space="preserve">GitHub repository (private): </w:t>
       </w:r>
-      <w:hyperlink w:history="1" r:id="rIdzjos6antbgafgibx6zqzy">
+      <w:hyperlink w:history="1" r:id="rIdtlai5as1kpig3bpil_1ag">
         <w:r>
           <w:rPr>
             <w:rStyle w:val="Hyperlink"/>
@@ -111,31 +111,6 @@
           <w:t xml:space="preserve">https://github.com/Dayoscape/advanced-database-portfolio</w:t>
         </w:r>
       </w:hyperlink>
-      <w:r>
-        <w:rPr>
-          <w:rFonts w:ascii="Calibri" w:cs="Calibri" w:eastAsia="Calibri" w:hAnsi="Calibri"/>
-          <w:sz w:val="20"/>
-          <w:szCs w:val="20"/>
-        </w:rPr>
-        <w:t xml:space="preserve"> (access given to the assessor: </w:t>
-      </w:r>
-      <w:r>
-        <w:rPr>
-          <w:rFonts w:ascii="Calibri" w:cs="Calibri" w:eastAsia="Calibri" w:hAnsi="Calibri"/>
-          <w:sz w:val="20"/>
-          <w:szCs w:val="20"/>
-          <w:highlight w:val="yellow"/>
-        </w:rPr>
-        <w:t xml:space="preserve">[confirm]</w:t>
-      </w:r>
-      <w:r>
-        <w:rPr>
-          <w:rFonts w:ascii="Calibri" w:cs="Calibri" w:eastAsia="Calibri" w:hAnsi="Calibri"/>
-          <w:sz w:val="20"/>
-          <w:szCs w:val="20"/>
-        </w:rPr>
-        <w:t xml:space="preserve">)</w:t>
-      </w:r>
     </w:p>
     <w:p>
       <w:pPr>
@@ -1131,11 +1106,20 @@
       <w:r>
         <w:rPr>
           <w:rFonts w:ascii="Calibri" w:cs="Calibri" w:eastAsia="Calibri" w:hAnsi="Calibri"/>
-          <w:sz w:val="20"/>
-          <w:szCs w:val="20"/>
-          <w:highlight w:val="yellow"/>
-        </w:rPr>
-        <w:t xml:space="preserve">[Add two or three sentences in your own words about what you found hardest and what you would do differently.]</w:t>
+          <w:b/>
+          <w:bCs/>
+          <w:sz w:val="20"/>
+          <w:szCs w:val="20"/>
+        </w:rPr>
+        <w:t xml:space="preserve">Hardest part and what I would change. </w:t>
+      </w:r>
+      <w:r>
+        <w:rPr>
+          <w:rFonts w:ascii="Calibri" w:cs="Calibri" w:eastAsia="Calibri" w:hAnsi="Calibri"/>
+          <w:sz w:val="20"/>
+          <w:szCs w:val="20"/>
+        </w:rPr>
+        <w:t xml:space="preserve">The hardest part was getting the tools working, not the database theory: Docker needed a Windows feature, PowerShell blocked my scripts until I allowed them for one session, and the cloud connection string had to be quoted because it contains an ampersand. Next time I would check the environment first and keep a short setup note. I would also repeat every benchmark several times from the start, because my first single timings were misleading.</w:t>
       </w:r>
     </w:p>
     <w:p>
@@ -1221,16 +1205,7 @@
           <w:sz w:val="20"/>
           <w:szCs w:val="20"/>
         </w:rPr>
-        <w:t xml:space="preserve">I ran the schema, demos and benchmarks on my own machine and saved the outputs and screenshots in the repository. I ran the oversell, deadlock, replication and MongoDB index demos and took the screenshots myself, and I created the Neon project and loaded the schema myself. Where results differed from what the AI had written (for example MongoDB timings) the documents were corrected to match my runs. </w:t>
-      </w:r>
-      <w:r>
-        <w:rPr>
-          <w:rFonts w:ascii="Calibri" w:cs="Calibri" w:eastAsia="Calibri" w:hAnsi="Calibri"/>
-          <w:sz w:val="20"/>
-          <w:szCs w:val="20"/>
-          <w:highlight w:val="yellow"/>
-        </w:rPr>
-        <w:t xml:space="preserve">[Add what you rewrote or changed yourself, and confirm you can explain each result.]</w:t>
+        <w:t xml:space="preserve">I ran the schema, demos and benchmarks on my own machine and saved the outputs and screenshots in the repository. I ran the oversell, deadlock, replication and MongoDB index demos and took the screenshots myself, and I created the Neon project and loaded the schema myself. Where results differed from what the AI had written (for example MongoDB timings) the documents were corrected to match my runs. I chose the case study and its name (ShopCave), retook a screenshot that showed a database password and reset that password, and rejected unsuitable early output (for example failed replication screenshots taken before the replica was ready). I understand that I remain responsible for the accuracy of everything I submit.</w:t>
       </w:r>
     </w:p>
     <w:p>
@@ -1372,9 +1347,8 @@
           <w:rFonts w:ascii="Calibri" w:cs="Calibri" w:eastAsia="Calibri" w:hAnsi="Calibri"/>
           <w:sz w:val="20"/>
           <w:szCs w:val="20"/>
-          <w:highlight w:val="yellow"/>
-        </w:rPr>
-        <w:t xml:space="preserve">[Add the course textbook and any lecture notes you used.]</w:t>
+        </w:rPr>
+        <w:t xml:space="preserve">School of Postgraduate Studies (2026/2027) MIT 8103 Advanced Database Systems: First Semester Continuous Assessment brief (Individual Practical Database Portfolio).</w:t>
       </w:r>
     </w:p>
     <w:p>
@@ -2159,7 +2133,7 @@
     </w:tbl>
     <w:sectPr>
       <w:pgSz w:w="11906" w:h="16838" w:orient="portrait"/>
-      <w:pgMar w:top="900" w:right="1000" w:bottom="900" w:left="1000" w:header="708" w:footer="708" w:gutter="0"/>
+      <w:pgMar w:top="760" w:right="1000" w:bottom="700" w:left="1000" w:header="708" w:footer="708" w:gutter="0"/>
       <w:pgNumType/>
       <w:docGrid w:linePitch="360"/>
     </w:sectPr>

</xml_diff>

<commit_message>
Add student name and matric number to final documentation
</commit_message>
<xml_diff>
--- a/docs/final-documentation.docx
+++ b/docs/final-documentation.docx
@@ -52,9 +52,8 @@
           <w:rFonts w:ascii="Calibri" w:cs="Calibri" w:eastAsia="Calibri" w:hAnsi="Calibri"/>
           <w:sz w:val="20"/>
           <w:szCs w:val="20"/>
-          <w:highlight w:val="yellow"/>
-        </w:rPr>
-        <w:t xml:space="preserve">[your full name]</w:t>
+        </w:rPr>
+        <w:t xml:space="preserve">Temidayo Michael Ige</w:t>
       </w:r>
       <w:r>
         <w:rPr>
@@ -79,9 +78,8 @@
           <w:rFonts w:ascii="Calibri" w:cs="Calibri" w:eastAsia="Calibri" w:hAnsi="Calibri"/>
           <w:sz w:val="20"/>
           <w:szCs w:val="20"/>
-          <w:highlight w:val="yellow"/>
-        </w:rPr>
-        <w:t xml:space="preserve">[your matric number]</w:t>
+        </w:rPr>
+        <w:t xml:space="preserve">2026/A/MIT/0316</w:t>
       </w:r>
     </w:p>
     <w:p>
@@ -98,7 +96,7 @@
         </w:rPr>
         <w:t xml:space="preserve">GitHub repository (private): </w:t>
       </w:r>
-      <w:hyperlink w:history="1" r:id="rIdtlai5as1kpig3bpil_1ag">
+      <w:hyperlink w:history="1" r:id="rIdwq5-zk0krje4ag8flagbi">
         <w:r>
           <w:rPr>
             <w:rStyle w:val="Hyperlink"/>

</xml_diff>

<commit_message>
State that the repository is public and why
</commit_message>
<xml_diff>
--- a/docs/final-documentation.docx
+++ b/docs/final-documentation.docx
@@ -94,9 +94,9 @@
           <w:sz w:val="20"/>
           <w:szCs w:val="20"/>
         </w:rPr>
-        <w:t xml:space="preserve">GitHub repository (private): </w:t>
-      </w:r>
-      <w:hyperlink w:history="1" r:id="rIdwq5-zk0krje4ag8flagbi">
+        <w:t xml:space="preserve">GitHub repository (public): </w:t>
+      </w:r>
+      <w:hyperlink w:history="1" r:id="rIdx26nop6bje1vcp43y8ngw">
         <w:r>
           <w:rPr>
             <w:rStyle w:val="Hyperlink"/>
@@ -109,6 +109,21 @@
           <w:t xml:space="preserve">https://github.com/Dayoscape/advanced-database-portfolio</w:t>
         </w:r>
       </w:hyperlink>
+    </w:p>
+    <w:p>
+      <w:pPr>
+        <w:spacing w:after="70" w:line="252"/>
+      </w:pPr>
+      <w:r>
+        <w:rPr>
+          <w:rFonts w:ascii="Calibri" w:cs="Calibri" w:eastAsia="Calibri" w:hAnsi="Calibri"/>
+          <w:i/>
+          <w:iCs/>
+          <w:sz w:val="18"/>
+          <w:szCs w:val="18"/>
+        </w:rPr>
+        <w:t xml:space="preserve">The repository is public because I could not obtain the assessor’s GitHub username to invite them to a private repository, so that the assessor can open it without an invitation.</w:t>
+      </w:r>
     </w:p>
     <w:p>
       <w:pPr>

</xml_diff>

<commit_message>
Reference datasets and tools; fix blank page before appendix
</commit_message>
<xml_diff>
--- a/docs/final-documentation.docx
+++ b/docs/final-documentation.docx
@@ -122,7 +122,7 @@
         </w:rPr>
         <w:t xml:space="preserve">GitHub repository (public): </w:t>
       </w:r>
-      <w:hyperlink w:history="1" r:id="rIdcp0dhomvf5tapdqn4hrsn">
+      <w:hyperlink w:history="1" r:id="rId9ro0kyzfx5cotj_f53xkp">
         <w:r>
           <w:rPr>
             <w:rStyle w:val="Hyperlink"/>
@@ -1333,7 +1333,7 @@
           <w:sz w:val="20"/>
           <w:szCs w:val="20"/>
         </w:rPr>
-        <w:t xml:space="preserve">Docker Inc. Docker Desktop and Docker Compose documentation. https://docs.docker.com/</w:t>
+        <w:t xml:space="preserve">Codd, E. F. (1970) A relational model of data for large shared data banks. Communications of the ACM, 13(6), 377–387.</w:t>
       </w:r>
     </w:p>
     <w:p>
@@ -1351,7 +1351,7 @@
           <w:sz w:val="20"/>
           <w:szCs w:val="20"/>
         </w:rPr>
-        <w:t xml:space="preserve">Codd, E. F. (1970) A relational model of data for large shared data banks. Communications of the ACM, 13(6), 377–387.</w:t>
+        <w:t xml:space="preserve">Gilbert, S. and Lynch, N. (2002) Brewer’s conjecture and the feasibility of consistent, available, partition-tolerant web services. ACM SIGACT News, 33(2), 51–59.</w:t>
       </w:r>
     </w:p>
     <w:p>
@@ -1369,7 +1369,7 @@
           <w:sz w:val="20"/>
           <w:szCs w:val="20"/>
         </w:rPr>
-        <w:t xml:space="preserve">Gilbert, S. and Lynch, N. (2002) Brewer’s conjecture and the feasibility of consistent, available, partition-tolerant web services. ACM SIGACT News, 33(2), 51–59.</w:t>
+        <w:t xml:space="preserve">Data and tools: all data is synthetic (seed.sql, seed.js in the repository; no external datasets). Tools: PostgreSQL 16, MongoDB 7, Docker, dbdiagram.io, Neon.</w:t>
       </w:r>
     </w:p>
     <w:p>
@@ -1387,18 +1387,14 @@
           <w:sz w:val="20"/>
           <w:szCs w:val="20"/>
         </w:rPr>
-        <w:t xml:space="preserve">School of Postgraduate Studies (2026/2027) MIT 8103 Advanced Database Systems: First Semester Continuous Assessment brief (Individual Practical Database Portfolio).</w:t>
-      </w:r>
-    </w:p>
-    <w:p>
-      <w:r>
-        <w:br w:type="page"/>
+        <w:t xml:space="preserve">School of Postgraduate Studies (2026/2027) MIT 8103 Continuous Assessment brief, Individual Practical Database Portfolio.</w:t>
       </w:r>
     </w:p>
     <w:p>
       <w:pPr>
         <w:pStyle w:val="Heading1"/>
-        <w:spacing w:after="60" w:before="150"/>
+        <w:pageBreakBefore/>
+        <w:spacing w:after="60" w:before="0"/>
       </w:pPr>
       <w:r>
         <w:rPr>

</xml_diff>